<commit_message>
Minimal changes have been done to organise everything
</commit_message>
<xml_diff>
--- a/Website Project Proposal/Website Project Proposal.docx
+++ b/Website Project Proposal/Website Project Proposal.docx
@@ -5,7 +5,12 @@
     <w:sdt>
       <w:sdtPr>
         <w:rPr>
+          <w:rFonts w:eastAsiaTheme="minorHAnsi"/>
+          <w:kern w:val="2"/>
           <w:sz w:val="2"/>
+          <w:szCs w:val="24"/>
+          <w:lang w:val="en-ZA"/>
+          <w14:ligatures w14:val="standardContextual"/>
         </w:rPr>
         <w:id w:val="883375782"/>
         <w:docPartObj>
@@ -15,15 +20,12 @@
       </w:sdtPr>
       <w:sdtEndPr>
         <w:rPr>
-          <w:rFonts w:eastAsiaTheme="minorHAnsi"/>
           <w:b/>
           <w:bCs/>
-          <w:kern w:val="2"/>
           <w:sz w:val="40"/>
           <w:szCs w:val="40"/>
           <w:u w:val="single"/>
           <w:lang w:val="en-GB"/>
-          <w14:ligatures w14:val="standardContextual"/>
         </w:rPr>
       </w:sdtEndPr>
       <w:sdtContent>
@@ -159,6 +161,7 @@
                                     <w:dataBinding w:prefixMappings="xmlns:ns0='http://purl.org/dc/elements/1.1/' xmlns:ns1='http://schemas.openxmlformats.org/package/2006/metadata/core-properties' " w:xpath="/ns1:coreProperties[1]/ns0:subject[1]" w:storeItemID="{6C3C8BC8-F283-45AE-878A-BAB7291924A1}"/>
                                     <w:text/>
                                   </w:sdtPr>
+                                  <w:sdtEndPr/>
                                   <w:sdtContent>
                                     <w:r>
                                       <w:rPr>
@@ -912,6 +915,7 @@
                                     <w:dataBinding w:prefixMappings="xmlns:ns0='http://schemas.openxmlformats.org/officeDocument/2006/extended-properties' " w:xpath="/ns0:Properties[1]/ns0:Company[1]" w:storeItemID="{6668398D-A668-4E3E-A5EB-62B293D839F1}"/>
                                     <w:text/>
                                   </w:sdtPr>
+                                  <w:sdtEndPr/>
                                   <w:sdtContent>
                                     <w:r>
                                       <w:rPr>
@@ -937,6 +941,7 @@
                                   <w:dataBinding w:prefixMappings="xmlns:ns0='http://purl.org/dc/elements/1.1/' xmlns:ns1='http://schemas.openxmlformats.org/package/2006/metadata/core-properties' " w:xpath="/ns1:coreProperties[1]/ns1:category[1]" w:storeItemID="{6C3C8BC8-F283-45AE-878A-BAB7291924A1}"/>
                                   <w:text/>
                                 </w:sdtPr>
+                                <w:sdtEndPr/>
                                 <w:sdtContent>
                                   <w:p>
                                     <w:pPr>
@@ -2916,19 +2921,7 @@
             <w:szCs w:val="22"/>
             <w:lang w:val="en-GB"/>
           </w:rPr>
-          <m:t>±31,</m:t>
-        </m:r>
-        <m:r>
-          <m:rPr>
-            <m:sty m:val="bi"/>
-          </m:rPr>
-          <w:rPr>
-            <w:rFonts w:ascii="Cambria Math" w:hAnsi="Cambria Math"/>
-            <w:sz w:val="22"/>
-            <w:szCs w:val="22"/>
-            <w:lang w:val="en-GB"/>
-          </w:rPr>
-          <m:t>200</m:t>
+          <m:t>±31,200</m:t>
         </m:r>
       </m:oMath>
     </w:p>
@@ -2973,10 +2966,10 @@
           <w:lang w:val="en-GB"/>
         </w:rPr>
         <w:drawing>
-          <wp:inline distT="0" distB="0" distL="0" distR="0" wp14:anchorId="1ABECE76" wp14:editId="590E8CF7">
+          <wp:inline distT="0" distB="0" distL="0" distR="0" wp14:anchorId="3E17FD62" wp14:editId="54191F05">
             <wp:extent cx="5731510" cy="3223895"/>
             <wp:effectExtent l="0" t="0" r="2540" b="0"/>
-            <wp:docPr id="468785421" name="Picture 1"/>
+            <wp:docPr id="900077655" name="Picture 8"/>
             <wp:cNvGraphicFramePr>
               <a:graphicFrameLocks xmlns:a="http://schemas.openxmlformats.org/drawingml/2006/main" noChangeAspect="1"/>
             </wp:cNvGraphicFramePr>
@@ -2984,7 +2977,7 @@
               <a:graphicData uri="http://schemas.openxmlformats.org/drawingml/2006/picture">
                 <pic:pic xmlns:pic="http://schemas.openxmlformats.org/drawingml/2006/picture">
                   <pic:nvPicPr>
-                    <pic:cNvPr id="468785421" name="Picture 468785421"/>
+                    <pic:cNvPr id="900077655" name="Picture 900077655"/>
                     <pic:cNvPicPr/>
                   </pic:nvPicPr>
                   <pic:blipFill>
@@ -3837,7 +3830,7 @@
           <w:szCs w:val="22"/>
         </w:rPr>
         <w:drawing>
-          <wp:inline distT="0" distB="0" distL="0" distR="0" wp14:anchorId="448CDA44" wp14:editId="264C414B">
+          <wp:inline distT="0" distB="0" distL="0" distR="0" wp14:anchorId="448CDA44" wp14:editId="2A21B67D">
             <wp:extent cx="5786759" cy="3857625"/>
             <wp:effectExtent l="0" t="0" r="4445" b="0"/>
             <wp:docPr id="25116695" name="Picture 1"/>

</xml_diff>